<commit_message>
Publish scratch thesis pitch site
</commit_message>
<xml_diff>
--- a/artifacts/output/doc/thesis_report_revised.docx
+++ b/artifacts/output/doc/thesis_report_revised.docx
@@ -1429,23 +1429,7 @@
         <w:jc w:val="both"/>
       </w:pPr>
       <w:r>
-        <w:t>Approved preliminary five-fold subject-disjoint internal validation completed across 5/5 folds under preliminary_internal_subject_disjoint_cv5, covering 15 complete paired subjects exactly once as held-out targets. This is internal validation, not external or clinical validation, and the n=3 held-out subjects per fold require cautious interpretation. No subject-level motion/FD/DVARS/confound/censoring stratification was available for the split. The approved manifest is the split-configuration record; the aggregate artifact is the authoritative completion record.</w:t>
-      </w:r>
-    </w:p>
-    <w:p>
-      <w:pPr>
-        <w:jc w:val="both"/>
-      </w:pPr>
-      <w:r>
-        <w:t>| CV5 descriptive item | Value | | --- | --- | | Approved manifest | output/validation/cv5_subject_disjoint/approved/subject_split_cv5_manifest_approved.json | | Aggregate artifact | output/validation/cv5_subject_disjoint/results/cv5_aggregate_validation.json | | Fold-averaged delta mismatch score | 15.7128 (fold SD 10.2613) | | Held-out score range | 5.8745 to 29.5082 | | Fold-averaged target-sign agreement | 0.6750 (fold SD 0.1896) | | Target-sign agreement range | 0.5000 to 0.8750 | | Selected perturbation family counts | more_cross_talk=5 | | Selected strength counts | 0.1=5 | | Reproduction command | uv run python scripts/run_cv5_validation.py --manifest output/validation/cv5_subject_disjoint/approved/subject_split_cv5_manifest_approved.json --output-dir output/validation/cv5_subject_disjoint/results --fit-iterations 64 --seed 11 |</w:t>
-      </w:r>
-    </w:p>
-    <w:p>
-      <w:pPr>
-        <w:jc w:val="both"/>
-      </w:pPr>
-      <w:r>
-        <w:t>These values are descriptive fold summaries. The fold standard deviation is not a confidence interval, and the result should not be interpreted as external predictive validity.</w:t>
+        <w:t>Subject-disjoint held-out validation has not yet been configured or performed for Stage 2/3; the current evidence remains calibration plus stochastic diagnostics.</w:t>
       </w:r>
     </w:p>
     <w:p>

</xml_diff>

<commit_message>
Publish refreshed thesis evidence snapshot
</commit_message>
<xml_diff>
--- a/artifacts/output/doc/thesis_report_revised.docx
+++ b/artifacts/output/doc/thesis_report_revised.docx
@@ -1429,7 +1429,23 @@
         <w:jc w:val="both"/>
       </w:pPr>
       <w:r>
-        <w:t>Subject-disjoint held-out validation has not yet been configured or performed for Stage 2/3; the current evidence remains calibration plus stochastic diagnostics.</w:t>
+        <w:t>Approved preliminary five-fold subject-disjoint internal validation completed across 5/5 folds under preliminary_internal_subject_disjoint_cv5, covering 15 complete paired subjects exactly once as held-out targets. This is internal validation, not external or clinical validation, and the n=3 held-out subjects per fold require cautious interpretation. The split itself was not stratified by subject-level fMRIPrep FD/DVARS/confound/censoring; the image-derived motion/QC sensitivity layer is reported separately. The approved manifest is the split-configuration record; the aggregate artifact is the authoritative completion record.</w:t>
+      </w:r>
+    </w:p>
+    <w:p>
+      <w:pPr>
+        <w:jc w:val="both"/>
+      </w:pPr>
+      <w:r>
+        <w:t>| CV5 descriptive item | Value | | --- | --- | | Approved manifest | output/validation/cv5_subject_disjoint/approved/subject_split_cv5_manifest_approved.json | | Aggregate artifact | output/validation/cv5_subject_disjoint/results/cv5_aggregate_validation.json | | Fold-averaged delta mismatch score | 15.7128 (fold SD 10.2613) | | Held-out score range | 5.8745 to 29.5082 | | Fold-averaged target-sign agreement | 0.6750 (fold SD 0.1896) | | Target-sign agreement range | 0.5000 to 0.8750 | | Selected perturbation family counts | more_cross_talk=5 | | Selected strength counts | 0.1=5 | | Reproduction command | uv run python scripts/run_cv5_validation.py --manifest output/validation/cv5_subject_disjoint/approved/subject_split_cv5_manifest_approved.json --output-dir output/validation/cv5_subject_disjoint/results --fit-iterations 64 --seed 11 |</w:t>
+      </w:r>
+    </w:p>
+    <w:p>
+      <w:pPr>
+        <w:jc w:val="both"/>
+      </w:pPr>
+      <w:r>
+        <w:t>These values are descriptive fold summaries. The fold standard deviation is not a confidence interval, and the result should not be interpreted as external predictive validity.</w:t>
       </w:r>
     </w:p>
     <w:p>

</xml_diff>

<commit_message>
Fix dashboard plot rendering
</commit_message>
<xml_diff>
--- a/artifacts/output/doc/thesis_report_revised.docx
+++ b/artifacts/output/doc/thesis_report_revised.docx
@@ -1429,23 +1429,7 @@
         <w:jc w:val="both"/>
       </w:pPr>
       <w:r>
-        <w:t>Approved preliminary five-fold subject-disjoint internal validation completed across 5/5 folds under preliminary_internal_subject_disjoint_cv5, covering 15 complete paired subjects exactly once as held-out targets. This is internal validation, not external or clinical validation, and the n=3 held-out subjects per fold require cautious interpretation. The split itself was not stratified by subject-level fMRIPrep FD/DVARS/confound/censoring; the image-derived motion/QC sensitivity layer is reported separately. The approved manifest is the split-configuration record; the aggregate artifact is the authoritative completion record.</w:t>
-      </w:r>
-    </w:p>
-    <w:p>
-      <w:pPr>
-        <w:jc w:val="both"/>
-      </w:pPr>
-      <w:r>
-        <w:t>| CV5 descriptive item | Value | | --- | --- | | Approved manifest | output/validation/cv5_subject_disjoint/approved/subject_split_cv5_manifest_approved.json | | Aggregate artifact | output/validation/cv5_subject_disjoint/results/cv5_aggregate_validation.json | | Fold-averaged delta mismatch score | 15.7128 (fold SD 10.2613) | | Held-out score range | 5.8745 to 29.5082 | | Fold-averaged target-sign agreement | 0.6750 (fold SD 0.1896) | | Target-sign agreement range | 0.5000 to 0.8750 | | Selected perturbation family counts | more_cross_talk=5 | | Selected strength counts | 0.1=5 | | Reproduction command | uv run python scripts/run_cv5_validation.py --manifest output/validation/cv5_subject_disjoint/approved/subject_split_cv5_manifest_approved.json --output-dir output/validation/cv5_subject_disjoint/results --fit-iterations 64 --seed 11 |</w:t>
-      </w:r>
-    </w:p>
-    <w:p>
-      <w:pPr>
-        <w:jc w:val="both"/>
-      </w:pPr>
-      <w:r>
-        <w:t>These values are descriptive fold summaries. The fold standard deviation is not a confidence interval, and the result should not be interpreted as external predictive validity.</w:t>
+        <w:t>Subject-disjoint held-out validation has not yet been configured or performed for Stage 2/3; the current evidence remains calibration plus stochastic diagnostics.</w:t>
       </w:r>
     </w:p>
     <w:p>

</xml_diff>

<commit_message>
Publish supervisor pitch site
</commit_message>
<xml_diff>
--- a/artifacts/output/doc/thesis_report_revised.docx
+++ b/artifacts/output/doc/thesis_report_revised.docx
@@ -1429,7 +1429,23 @@
         <w:jc w:val="both"/>
       </w:pPr>
       <w:r>
-        <w:t>Subject-disjoint held-out validation has not yet been configured or performed for Stage 2/3; the current evidence remains calibration plus stochastic diagnostics.</w:t>
+        <w:t>Approved preliminary five-fold subject-disjoint internal validation completed across 5/5 folds under preliminary_internal_subject_disjoint_cv5, covering 15 complete paired subjects exactly once as held-out targets. This is internal validation, not external or clinical validation, and the n=3 held-out subjects per fold require cautious interpretation. The split itself was not stratified by subject-level fMRIPrep FD/DVARS/confound/censoring; the image-derived motion/QC sensitivity layer is reported separately. The approved manifest is the split-configuration record; the aggregate artifact is the authoritative completion record.</w:t>
+      </w:r>
+    </w:p>
+    <w:p>
+      <w:pPr>
+        <w:jc w:val="both"/>
+      </w:pPr>
+      <w:r>
+        <w:t>| CV5 descriptive item | Value | | --- | --- | | Approved manifest | output/validation/cv5_subject_disjoint/approved/subject_split_cv5_manifest_approved.json | | Aggregate artifact | output/validation/cv5_subject_disjoint/results/cv5_aggregate_validation.json | | Fold-averaged delta mismatch score | 15.7128 (fold SD 10.2613) | | Held-out score range | 5.8745 to 29.5082 | | Fold-averaged target-sign agreement | 0.6750 (fold SD 0.1896) | | Target-sign agreement range | 0.5000 to 0.8750 | | Selected perturbation family counts | more_cross_talk=5 | | Selected strength counts | 0.1=5 | | Reproduction command | uv run python scripts/run_cv5_validation.py --manifest output/validation/cv5_subject_disjoint/approved/subject_split_cv5_manifest_approved.json --output-dir output/validation/cv5_subject_disjoint/results --fit-iterations 64 --seed 11 |</w:t>
+      </w:r>
+    </w:p>
+    <w:p>
+      <w:pPr>
+        <w:jc w:val="both"/>
+      </w:pPr>
+      <w:r>
+        <w:t>These values are descriptive fold summaries. The fold standard deviation is not a confidence interval, and the result should not be interpreted as external predictive validity.</w:t>
       </w:r>
     </w:p>
     <w:p>

</xml_diff>